<commit_message>
Revision 2: Premium Mainframe Developer resume per updated spec
- Title -> Mainframe Software Engineer | COBOL | HP NonStop
- Add target-role line carrying exact phrase 'Mainframe Developer'
- Summary/bullets reworked: OSS, OLTP, batch, file processing, deployment
  support, software maintenance, high availability, system reliability
- Skills regrouped into 10 prescribed sections; add OSS, FTP, Problem Management
- verify.py: fail build if IBM z/OS tech (CICS/JCL/DB2/VSAM/IMS/...) introduced
- build_pdf.py: hard 8.05pt font floor (parse rate 95% -> 100%)
- 42/42 mandatory keywords, 23/23 facts, 56/56 skill tokens, 0 z/OS terms

Co-authored-by: arena-agent <297053741+arena-agent@users.noreply.github.com>
</commit_message>
<xml_diff>
--- a/Pratik_Shinde_Mainframe_COBOL_Developer_Resume.docx
+++ b/Pratik_Shinde_Mainframe_COBOL_Developer_Resume.docx
@@ -4,7 +4,7 @@
   <w:body>
     <w:p>
       <w:pPr>
-        <w:spacing w:before="0" w:after="38" w:line="240" w:lineRule="auto"/>
+        <w:spacing w:before="0" w:after="36" w:line="240" w:lineRule="auto"/>
         <w:jc w:val="center"/>
       </w:pPr>
       <w:r>
@@ -13,15 +13,15 @@
           <w:b/>
           <w:i w:val="0"/>
           <w:color w:val="0F2A47"/>
-          <w:sz w:val="39"/>
-          <w:spacing w:val="35"/>
+          <w:sz w:val="37"/>
+          <w:spacing w:val="33"/>
         </w:rPr>
         <w:t>PRATIK SHINDE</w:t>
       </w:r>
     </w:p>
     <w:p>
       <w:pPr>
-        <w:spacing w:before="0" w:after="38" w:line="240" w:lineRule="auto"/>
+        <w:spacing w:before="0" w:after="36" w:line="240" w:lineRule="auto"/>
         <w:jc w:val="center"/>
       </w:pPr>
       <w:r>
@@ -30,18 +30,15 @@
           <w:b/>
           <w:i w:val="0"/>
           <w:color w:val="3C4A59"/>
-          <w:sz w:val="17"/>
+          <w:sz w:val="16"/>
         </w:rPr>
-        <w:t>Mainframe COBOL Developer  |  HP NonStop (Tandem) Developer  |  Banking Payment Systems  |  L3 Production Support</w:t>
+        <w:t>Mainframe Software Engineer  |  COBOL  |  HP NonStop</w:t>
       </w:r>
     </w:p>
     <w:p>
       <w:pPr>
-        <w:spacing w:before="0" w:after="57" w:line="240" w:lineRule="auto"/>
+        <w:spacing w:before="0" w:after="36" w:line="240" w:lineRule="auto"/>
         <w:jc w:val="center"/>
-        <w:pBdr>
-          <w:bottom w:val="single" w:sz="8" w:space="2" w:color="0F2A47"/>
-        </w:pBdr>
       </w:pPr>
       <w:r>
         <w:rPr>
@@ -49,14 +46,15 @@
           <w:b w:val="0"/>
           <w:i w:val="0"/>
           <w:color w:val="111418"/>
-          <w:sz w:val="16"/>
+          <w:sz w:val="15"/>
         </w:rPr>
         <w:t>pratikshinde1002@gmail.com  |  +91-7507444969  |  Chhatrapati Sambhajinagar, Maharashtra, India  |  linkedin.com/in/pratik-shinde-a113b3220</w:t>
       </w:r>
     </w:p>
     <w:p>
       <w:pPr>
-        <w:spacing w:before="0" w:after="57" w:line="240" w:lineRule="auto"/>
+        <w:spacing w:before="0" w:after="54" w:line="240" w:lineRule="auto"/>
+        <w:jc w:val="center"/>
         <w:pBdr>
           <w:bottom w:val="single" w:sz="8" w:space="2" w:color="0F2A47"/>
         </w:pBdr>
@@ -67,8 +65,26 @@
           <w:b/>
           <w:i w:val="0"/>
           <w:color w:val="0F2A47"/>
-          <w:sz w:val="18"/>
-          <w:spacing w:val="15"/>
+          <w:sz w:val="15"/>
+        </w:rPr>
+        <w:t>Target Roles: Mainframe Developer  |  COBOL Developer  |  Mainframe Application Developer  |  Production Support Engineer</w:t>
+      </w:r>
+    </w:p>
+    <w:p>
+      <w:pPr>
+        <w:spacing w:before="0" w:after="54" w:line="240" w:lineRule="auto"/>
+        <w:pBdr>
+          <w:bottom w:val="single" w:sz="8" w:space="2" w:color="0F2A47"/>
+        </w:pBdr>
+      </w:pPr>
+      <w:r>
+        <w:rPr>
+          <w:rFonts w:ascii="Calibri" w:hAnsi="Calibri" w:cs="Calibri" w:eastAsia="Calibri"/>
+          <w:b/>
+          <w:i w:val="0"/>
+          <w:color w:val="0F2A47"/>
+          <w:sz w:val="17"/>
+          <w:spacing w:val="14"/>
         </w:rPr>
         <w:t>PROFESSIONAL SUMMARY</w:t>
       </w:r>
@@ -84,14 +100,14 @@
           <w:b w:val="0"/>
           <w:i w:val="0"/>
           <w:color w:val="111418"/>
-          <w:sz w:val="17"/>
+          <w:sz w:val="16"/>
         </w:rPr>
-        <w:t>Results-driven Mainframe and Enterprise Application Developer with 2.10+ years of experience building, enhancing and supporting mission-critical banking and financial services applications at Tata Consultancy Services (TCS). Skilled in COBOL, TAL, TACL, TACL Macro, ENFORM, DDL and SQL across HP NonStop (HP Tandem) Guardian environments, with exposure to Enscribe, NonStop SQL/MP, TMF, EMS, OSS and the FUP, DBUX and SQLCI utilities. Strong in high-volume SWIFT and SEPA payment processing, batch and real-time flows, IBM MQ, RabbitMQ and SFTP integration, and Java, Spring Boot and REST API development across distributed banking applications. Recognised for L3 production support, incident management, Root Cause Analysis, performance optimization and application maintenance and enhancement in Agile Scrum SDLC environments.</w:t>
+        <w:t>Mainframe Software Engineer with 2.10+ years of experience spanning Mainframe Development, Application Development, Application Maintenance and Application Enhancement for mission-critical banking and financial services applications at Tata Consultancy Services (TCS). Skilled in COBOL, TAL, TACL, TACL Macro, ENFORM, DDL, SQL and Shell Scripting across HP NonStop (HP Tandem) Guardian and OSS environments, with exposure to Enscribe, NonStop SQL/MP, TMF, EMS and the FUP, DBUX and SQLCI utilities. Experienced in high-volume SWIFT and SEPA payment processing, batch processing and real-time online transaction processing, Oracle SQL development, and IBM MQ, RabbitMQ and SFTP integration. Recognised for L3 production support, incident management, Root Cause Analysis, performance optimization and software maintenance that sustain high availability and system reliability across enterprise applications, delivered in Agile Scrum SDLC environments.</w:t>
       </w:r>
     </w:p>
     <w:p>
       <w:pPr>
-        <w:spacing w:before="125" w:after="57" w:line="240" w:lineRule="auto"/>
+        <w:spacing w:before="118" w:after="54" w:line="240" w:lineRule="auto"/>
         <w:pBdr>
           <w:bottom w:val="single" w:sz="8" w:space="2" w:color="0F2A47"/>
         </w:pBdr>
@@ -102,8 +118,8 @@
           <w:b/>
           <w:i w:val="0"/>
           <w:color w:val="0F2A47"/>
-          <w:sz w:val="18"/>
-          <w:spacing w:val="15"/>
+          <w:sz w:val="17"/>
+          <w:spacing w:val="14"/>
         </w:rPr>
         <w:t>PROFESSIONAL EXPERIENCE</w:t>
       </w:r>
@@ -121,7 +137,7 @@
           <w:b/>
           <w:i w:val="0"/>
           <w:color w:val="111418"/>
-          <w:sz w:val="19"/>
+          <w:sz w:val="18"/>
         </w:rPr>
         <w:t>Systems Engineer</w:t>
       </w:r>
@@ -131,7 +147,7 @@
           <w:b/>
           <w:i w:val="0"/>
           <w:color w:val="3C4A59"/>
-          <w:sz w:val="18"/>
+          <w:sz w:val="17"/>
         </w:rPr>
         <w:tab/>
         <w:t>Sep 2023 – Present</w:t>
@@ -139,7 +155,7 @@
     </w:p>
     <w:p>
       <w:pPr>
-        <w:spacing w:before="19" w:after="57" w:line="240" w:lineRule="auto"/>
+        <w:spacing w:before="18" w:after="54" w:line="240" w:lineRule="auto"/>
       </w:pPr>
       <w:r>
         <w:rPr>
@@ -147,7 +163,7 @@
           <w:b w:val="0"/>
           <w:i/>
           <w:color w:val="3C4A59"/>
-          <w:sz w:val="17"/>
+          <w:sz w:val="16"/>
         </w:rPr>
         <w:t>Tata Consultancy Services (TCS)  |  Thane, India</w:t>
       </w:r>
@@ -155,7 +171,7 @@
     <w:p>
       <w:pPr>
         <w:pStyle w:val="ListBullet"/>
-        <w:spacing w:before="0" w:after="30" w:line="240" w:lineRule="auto"/>
+        <w:spacing w:before="0" w:after="29" w:line="240" w:lineRule="auto"/>
         <w:ind w:left="238" w:hanging="170"/>
         <w:jc w:val="both"/>
       </w:pPr>
@@ -165,15 +181,15 @@
           <w:b w:val="0"/>
           <w:i w:val="0"/>
           <w:color w:val="111418"/>
-          <w:sz w:val="17"/>
+          <w:sz w:val="16"/>
         </w:rPr>
-        <w:t>Engineered and maintained Java-based payment processing systems handling high-volume banking transactions, sustaining 99.9% availability across enterprise banking infrastructure spanning HP NonStop (Tandem) and distributed platforms.</w:t>
+        <w:t>Engineered and maintained Java-based payment processing systems handling high-volume banking transactions, sustaining 99.9% availability and system reliability across mission-critical enterprise banking infrastructure spanning HP NonStop (Tandem) and distributed platforms.</w:t>
       </w:r>
     </w:p>
     <w:p>
       <w:pPr>
         <w:pStyle w:val="ListBullet"/>
-        <w:spacing w:before="0" w:after="30" w:line="240" w:lineRule="auto"/>
+        <w:spacing w:before="0" w:after="29" w:line="240" w:lineRule="auto"/>
         <w:ind w:left="238" w:hanging="170"/>
         <w:jc w:val="both"/>
       </w:pPr>
@@ -183,15 +199,15 @@
           <w:b w:val="0"/>
           <w:i w:val="0"/>
           <w:color w:val="111418"/>
-          <w:sz w:val="17"/>
+          <w:sz w:val="16"/>
         </w:rPr>
-        <w:t>Optimized batch and real-time payment processing flows for SWIFT and SEPA transactions, achieving an approximate 20% reduction in processing time through performance tuning and code optimization.</w:t>
+        <w:t>Optimized batch processing and real-time online transaction processing flows for SWIFT and SEPA payments, achieving an approximate 20% reduction in processing time through performance optimization and code tuning.</w:t>
       </w:r>
     </w:p>
     <w:p>
       <w:pPr>
         <w:pStyle w:val="ListBullet"/>
-        <w:spacing w:before="0" w:after="30" w:line="240" w:lineRule="auto"/>
+        <w:spacing w:before="0" w:after="29" w:line="240" w:lineRule="auto"/>
         <w:ind w:left="238" w:hanging="170"/>
         <w:jc w:val="both"/>
       </w:pPr>
@@ -201,15 +217,15 @@
           <w:b w:val="0"/>
           <w:i w:val="0"/>
           <w:color w:val="111418"/>
-          <w:sz w:val="17"/>
+          <w:sz w:val="16"/>
         </w:rPr>
-        <w:t>Delivered L3 production support for mission-critical banking applications, resolving critical incidents and reducing downtime by 30% through disciplined Root Cause Analysis (RCA), incident management and corrective action.</w:t>
+        <w:t>Delivered L3 production support across mission-critical banking applications, driving incident resolution and reducing downtime by 30% through disciplined Root Cause Analysis (RCA), incident management and corrective action.</w:t>
       </w:r>
     </w:p>
     <w:p>
       <w:pPr>
         <w:pStyle w:val="ListBullet"/>
-        <w:spacing w:before="0" w:after="30" w:line="240" w:lineRule="auto"/>
+        <w:spacing w:before="0" w:after="29" w:line="240" w:lineRule="auto"/>
         <w:ind w:left="238" w:hanging="170"/>
         <w:jc w:val="both"/>
       </w:pPr>
@@ -219,15 +235,15 @@
           <w:b w:val="0"/>
           <w:i w:val="0"/>
           <w:color w:val="111418"/>
-          <w:sz w:val="17"/>
+          <w:sz w:val="16"/>
         </w:rPr>
-        <w:t>Debugged and enhanced core Java components, measurably improving performance, stability and maintainability of mission-critical enterprise banking applications under ongoing application maintenance and enhancement.</w:t>
+        <w:t>Debugged and enhanced core application components, measurably improving performance, stability and maintainability of enterprise banking systems under continuous application maintenance, software maintenance and enhancement.</w:t>
       </w:r>
     </w:p>
     <w:p>
       <w:pPr>
         <w:pStyle w:val="ListBullet"/>
-        <w:spacing w:before="0" w:after="30" w:line="240" w:lineRule="auto"/>
+        <w:spacing w:before="0" w:after="29" w:line="240" w:lineRule="auto"/>
         <w:ind w:left="238" w:hanging="170"/>
         <w:jc w:val="both"/>
       </w:pPr>
@@ -237,7 +253,7 @@
           <w:b w:val="0"/>
           <w:i w:val="0"/>
           <w:color w:val="111418"/>
-          <w:sz w:val="17"/>
+          <w:sz w:val="16"/>
         </w:rPr>
         <w:t>Designed and implemented reconciliation and settlement modules, ensuring accurate financial reporting and full compliance with banking regulatory standards.</w:t>
       </w:r>
@@ -245,7 +261,7 @@
     <w:p>
       <w:pPr>
         <w:pStyle w:val="ListBullet"/>
-        <w:spacing w:before="0" w:after="30" w:line="240" w:lineRule="auto"/>
+        <w:spacing w:before="0" w:after="29" w:line="240" w:lineRule="auto"/>
         <w:ind w:left="238" w:hanging="170"/>
         <w:jc w:val="both"/>
       </w:pPr>
@@ -255,15 +271,15 @@
           <w:b w:val="0"/>
           <w:i w:val="0"/>
           <w:color w:val="111418"/>
-          <w:sz w:val="17"/>
+          <w:sz w:val="16"/>
         </w:rPr>
-        <w:t>Integrated IBM MQ and SFTP interfaces enabling secure, reliable and efficient data exchange across distributed enterprise banking platforms.</w:t>
+        <w:t>Integrated IBM MQ and SFTP interfaces enabling secure file processing and reliable data exchange across distributed enterprise banking platforms.</w:t>
       </w:r>
     </w:p>
     <w:p>
       <w:pPr>
         <w:pStyle w:val="ListBullet"/>
-        <w:spacing w:before="0" w:after="30" w:line="240" w:lineRule="auto"/>
+        <w:spacing w:before="0" w:after="29" w:line="240" w:lineRule="auto"/>
         <w:ind w:left="238" w:hanging="170"/>
         <w:jc w:val="both"/>
       </w:pPr>
@@ -273,15 +289,15 @@
           <w:b w:val="0"/>
           <w:i w:val="0"/>
           <w:color w:val="111418"/>
-          <w:sz w:val="17"/>
+          <w:sz w:val="16"/>
         </w:rPr>
-        <w:t>Collaborated with cross-functional teams in an Agile Scrum environment to deliver on-time releases, manage sprint deliverables and align delivery with business objectives.</w:t>
+        <w:t>Collaborated with cross-functional teams in an Agile Scrum environment to deliver on-time releases, manage sprint deliverables and align delivery with business objectives across the SDLC.</w:t>
       </w:r>
     </w:p>
     <w:p>
       <w:pPr>
         <w:pStyle w:val="ListBullet"/>
-        <w:spacing w:before="0" w:after="30" w:line="240" w:lineRule="auto"/>
+        <w:spacing w:before="0" w:after="29" w:line="240" w:lineRule="auto"/>
         <w:ind w:left="238" w:hanging="170"/>
         <w:jc w:val="both"/>
       </w:pPr>
@@ -291,14 +307,14 @@
           <w:b w:val="0"/>
           <w:i w:val="0"/>
           <w:color w:val="111418"/>
-          <w:sz w:val="17"/>
+          <w:sz w:val="16"/>
         </w:rPr>
-        <w:t>Contributed to code reviews, unit testing, system testing and CI/CD pipeline execution to uphold code quality standards and accelerate deployment cycles across the SDLC.</w:t>
+        <w:t>Contributed to code reviews, unit testing, system testing and CI/CD pipeline execution, upholding code quality standards and providing deployment support that accelerated release cycles.</w:t>
       </w:r>
     </w:p>
     <w:p>
       <w:pPr>
-        <w:spacing w:before="125" w:after="57" w:line="240" w:lineRule="auto"/>
+        <w:spacing w:before="118" w:after="54" w:line="240" w:lineRule="auto"/>
         <w:pBdr>
           <w:bottom w:val="single" w:sz="8" w:space="2" w:color="0F2A47"/>
         </w:pBdr>
@@ -309,8 +325,8 @@
           <w:b/>
           <w:i w:val="0"/>
           <w:color w:val="0F2A47"/>
-          <w:sz w:val="18"/>
-          <w:spacing w:val="15"/>
+          <w:sz w:val="17"/>
+          <w:spacing w:val="14"/>
         </w:rPr>
         <w:t>KEY PROJECTS</w:t>
       </w:r>
@@ -318,7 +334,7 @@
     <w:p>
       <w:pPr>
         <w:pStyle w:val="ListBullet"/>
-        <w:spacing w:before="0" w:after="38" w:line="240" w:lineRule="auto"/>
+        <w:spacing w:before="0" w:after="36" w:line="240" w:lineRule="auto"/>
         <w:ind w:left="238" w:hanging="170"/>
         <w:jc w:val="both"/>
       </w:pPr>
@@ -328,7 +344,7 @@
           <w:b/>
           <w:i w:val="0"/>
           <w:color w:val="111418"/>
-          <w:sz w:val="17"/>
+          <w:sz w:val="16"/>
         </w:rPr>
         <w:t>Banking Payment Processing System</w:t>
       </w:r>
@@ -338,7 +354,7 @@
           <w:b w:val="0"/>
           <w:i w:val="0"/>
           <w:color w:val="111418"/>
-          <w:sz w:val="17"/>
+          <w:sz w:val="16"/>
         </w:rPr>
         <w:t xml:space="preserve"> — Developed and maintained Java Spring Boot microservices for high-volume SWIFT and SEPA payment processing. Built REST APIs, optimized backend performance and resolved critical L3 production issues safeguarding transaction throughput and system stability. </w:t>
       </w:r>
@@ -348,7 +364,7 @@
           <w:b/>
           <w:i w:val="0"/>
           <w:color w:val="111418"/>
-          <w:sz w:val="17"/>
+          <w:sz w:val="16"/>
         </w:rPr>
         <w:t>Technologies:</w:t>
       </w:r>
@@ -358,7 +374,7 @@
           <w:b w:val="0"/>
           <w:i/>
           <w:color w:val="111418"/>
-          <w:sz w:val="17"/>
+          <w:sz w:val="16"/>
         </w:rPr>
         <w:t xml:space="preserve"> Java, Spring Boot, Microservices, REST APIs, Oracle SQL.</w:t>
       </w:r>
@@ -366,7 +382,7 @@
     <w:p>
       <w:pPr>
         <w:pStyle w:val="ListBullet"/>
-        <w:spacing w:before="0" w:after="38" w:line="240" w:lineRule="auto"/>
+        <w:spacing w:before="0" w:after="36" w:line="240" w:lineRule="auto"/>
         <w:ind w:left="238" w:hanging="170"/>
         <w:jc w:val="both"/>
       </w:pPr>
@@ -376,7 +392,7 @@
           <w:b/>
           <w:i w:val="0"/>
           <w:color w:val="111418"/>
-          <w:sz w:val="17"/>
+          <w:sz w:val="16"/>
         </w:rPr>
         <w:t>Enterprise Banking Transaction Management System</w:t>
       </w:r>
@@ -386,7 +402,7 @@
           <w:b w:val="0"/>
           <w:i w:val="0"/>
           <w:color w:val="111418"/>
-          <w:sz w:val="17"/>
+          <w:sz w:val="16"/>
         </w:rPr>
         <w:t xml:space="preserve"> — Architected backend services for transaction validation, reconciliation and settlement using Java, Spring Boot and Oracle SQL to ensure data integrity, accurate financial reporting and regulatory compliance. </w:t>
       </w:r>
@@ -396,7 +412,7 @@
           <w:b/>
           <w:i w:val="0"/>
           <w:color w:val="111418"/>
-          <w:sz w:val="17"/>
+          <w:sz w:val="16"/>
         </w:rPr>
         <w:t>Technologies:</w:t>
       </w:r>
@@ -406,7 +422,7 @@
           <w:b w:val="0"/>
           <w:i/>
           <w:color w:val="111418"/>
-          <w:sz w:val="17"/>
+          <w:sz w:val="16"/>
         </w:rPr>
         <w:t xml:space="preserve"> Java, Spring Boot, Oracle SQL, Hibernate.</w:t>
       </w:r>
@@ -414,7 +430,7 @@
     <w:p>
       <w:pPr>
         <w:pStyle w:val="ListBullet"/>
-        <w:spacing w:before="0" w:after="38" w:line="240" w:lineRule="auto"/>
+        <w:spacing w:before="0" w:after="36" w:line="240" w:lineRule="auto"/>
         <w:ind w:left="238" w:hanging="170"/>
         <w:jc w:val="both"/>
       </w:pPr>
@@ -424,7 +440,7 @@
           <w:b/>
           <w:i w:val="0"/>
           <w:color w:val="111418"/>
-          <w:sz w:val="17"/>
+          <w:sz w:val="16"/>
         </w:rPr>
         <w:t>Enterprise Banking Infrastructure Modernization &amp; Test Automation</w:t>
       </w:r>
@@ -434,7 +450,7 @@
           <w:b w:val="0"/>
           <w:i w:val="0"/>
           <w:color w:val="111418"/>
-          <w:sz w:val="17"/>
+          <w:sz w:val="16"/>
         </w:rPr>
         <w:t xml:space="preserve"> — Enhanced legacy banking applications with scalable microservices architecture and REST APIs. Contributed to CI/CD automation, testing and controlled production deployments across enterprise environments. </w:t>
       </w:r>
@@ -444,7 +460,7 @@
           <w:b/>
           <w:i w:val="0"/>
           <w:color w:val="111418"/>
-          <w:sz w:val="17"/>
+          <w:sz w:val="16"/>
         </w:rPr>
         <w:t>Technologies:</w:t>
       </w:r>
@@ -454,14 +470,14 @@
           <w:b w:val="0"/>
           <w:i/>
           <w:color w:val="111418"/>
-          <w:sz w:val="17"/>
+          <w:sz w:val="16"/>
         </w:rPr>
         <w:t xml:space="preserve"> Java, Spring Boot, Jenkins, Docker, Git.</w:t>
       </w:r>
     </w:p>
     <w:p>
       <w:pPr>
-        <w:spacing w:before="125" w:after="57" w:line="240" w:lineRule="auto"/>
+        <w:spacing w:before="118" w:after="54" w:line="240" w:lineRule="auto"/>
         <w:pBdr>
           <w:bottom w:val="single" w:sz="8" w:space="2" w:color="0F2A47"/>
         </w:pBdr>
@@ -472,8 +488,8 @@
           <w:b/>
           <w:i w:val="0"/>
           <w:color w:val="0F2A47"/>
-          <w:sz w:val="18"/>
-          <w:spacing w:val="15"/>
+          <w:sz w:val="17"/>
+          <w:spacing w:val="14"/>
         </w:rPr>
         <w:t>TECHNICAL SKILLS</w:t>
       </w:r>
@@ -481,7 +497,7 @@
     <w:p>
       <w:pPr>
         <w:pStyle w:val="ListBullet"/>
-        <w:spacing w:before="0" w:after="28" w:line="240" w:lineRule="auto"/>
+        <w:spacing w:before="0" w:after="27" w:line="240" w:lineRule="auto"/>
         <w:ind w:left="238" w:hanging="170"/>
         <w:jc w:val="left"/>
       </w:pPr>
@@ -491,7 +507,7 @@
           <w:b/>
           <w:i w:val="0"/>
           <w:color w:val="111418"/>
-          <w:sz w:val="17"/>
+          <w:sz w:val="16"/>
         </w:rPr>
         <w:t>Programming Languages:</w:t>
       </w:r>
@@ -501,15 +517,15 @@
           <w:b w:val="0"/>
           <w:i w:val="0"/>
           <w:color w:val="111418"/>
-          <w:sz w:val="17"/>
+          <w:sz w:val="16"/>
         </w:rPr>
-        <w:t xml:space="preserve"> Java, COBOL, TAL, TACL, TACL Macro, ENFORM, DDL, SQL, Shell Scripting, Python, HTML, CSS, JavaScript</w:t>
+        <w:t xml:space="preserve"> COBOL, TAL, TACL, TACL Macro, ENFORM, DDL, SQL, Shell Scripting, Java, Python, HTML, CSS, JavaScript</w:t>
       </w:r>
     </w:p>
     <w:p>
       <w:pPr>
         <w:pStyle w:val="ListBullet"/>
-        <w:spacing w:before="0" w:after="28" w:line="240" w:lineRule="auto"/>
+        <w:spacing w:before="0" w:after="27" w:line="240" w:lineRule="auto"/>
         <w:ind w:left="238" w:hanging="170"/>
         <w:jc w:val="left"/>
       </w:pPr>
@@ -519,7 +535,7 @@
           <w:b/>
           <w:i w:val="0"/>
           <w:color w:val="111418"/>
-          <w:sz w:val="17"/>
+          <w:sz w:val="16"/>
         </w:rPr>
         <w:t>Mainframe Technologies:</w:t>
       </w:r>
@@ -529,15 +545,15 @@
           <w:b w:val="0"/>
           <w:i w:val="0"/>
           <w:color w:val="111418"/>
-          <w:sz w:val="17"/>
+          <w:sz w:val="16"/>
         </w:rPr>
-        <w:t xml:space="preserve"> HP NonStop, HP Tandem, Guardian, Enscribe, SQL/MP, NonStop SQL, TMF, EMS, OSS</w:t>
+        <w:t xml:space="preserve"> HP NonStop, HP Tandem, Guardian, OSS, SQL/MP, NonStop SQL, Enscribe, TMF, EMS</w:t>
       </w:r>
     </w:p>
     <w:p>
       <w:pPr>
         <w:pStyle w:val="ListBullet"/>
-        <w:spacing w:before="0" w:after="28" w:line="240" w:lineRule="auto"/>
+        <w:spacing w:before="0" w:after="27" w:line="240" w:lineRule="auto"/>
         <w:ind w:left="238" w:hanging="170"/>
         <w:jc w:val="left"/>
       </w:pPr>
@@ -547,9 +563,9 @@
           <w:b/>
           <w:i w:val="0"/>
           <w:color w:val="111418"/>
-          <w:sz w:val="17"/>
+          <w:sz w:val="16"/>
         </w:rPr>
-        <w:t>Mainframe Utilities:</w:t>
+        <w:t>Utilities:</w:t>
       </w:r>
       <w:r>
         <w:rPr>
@@ -557,7 +573,7 @@
           <w:b w:val="0"/>
           <w:i w:val="0"/>
           <w:color w:val="111418"/>
-          <w:sz w:val="17"/>
+          <w:sz w:val="16"/>
         </w:rPr>
         <w:t xml:space="preserve"> FUP, DBUX, ENSCRIBE, SQLCI</w:t>
       </w:r>
@@ -565,7 +581,7 @@
     <w:p>
       <w:pPr>
         <w:pStyle w:val="ListBullet"/>
-        <w:spacing w:before="0" w:after="28" w:line="240" w:lineRule="auto"/>
+        <w:spacing w:before="0" w:after="27" w:line="240" w:lineRule="auto"/>
         <w:ind w:left="238" w:hanging="170"/>
         <w:jc w:val="left"/>
       </w:pPr>
@@ -575,7 +591,7 @@
           <w:b/>
           <w:i w:val="0"/>
           <w:color w:val="111418"/>
-          <w:sz w:val="17"/>
+          <w:sz w:val="16"/>
         </w:rPr>
         <w:t>Environment / Platforms:</w:t>
       </w:r>
@@ -585,15 +601,15 @@
           <w:b w:val="0"/>
           <w:i w:val="0"/>
           <w:color w:val="111418"/>
-          <w:sz w:val="17"/>
+          <w:sz w:val="16"/>
         </w:rPr>
-        <w:t xml:space="preserve"> HP TANDEM, HP NONSTOP, CAIL NODES, RMS, SFTP, RabbitMQ, IBM MQ</w:t>
+        <w:t xml:space="preserve"> HP TANDEM, HP NONSTOP, CAIL NODES, RMS, OSS</w:t>
       </w:r>
     </w:p>
     <w:p>
       <w:pPr>
         <w:pStyle w:val="ListBullet"/>
-        <w:spacing w:before="0" w:after="28" w:line="240" w:lineRule="auto"/>
+        <w:spacing w:before="0" w:after="27" w:line="240" w:lineRule="auto"/>
         <w:ind w:left="238" w:hanging="170"/>
         <w:jc w:val="left"/>
       </w:pPr>
@@ -603,9 +619,9 @@
           <w:b/>
           <w:i w:val="0"/>
           <w:color w:val="111418"/>
-          <w:sz w:val="17"/>
+          <w:sz w:val="16"/>
         </w:rPr>
-        <w:t>Backend &amp; Integration:</w:t>
+        <w:t>Messaging &amp; Integration:</w:t>
       </w:r>
       <w:r>
         <w:rPr>
@@ -613,15 +629,15 @@
           <w:b w:val="0"/>
           <w:i w:val="0"/>
           <w:color w:val="111418"/>
-          <w:sz w:val="17"/>
+          <w:sz w:val="16"/>
         </w:rPr>
-        <w:t xml:space="preserve"> Java 8 (Collections, Streams API, Lambda, Functional Interfaces, Exception Handling, Concurrency), Spring Boot, REST APIs, Microservices, Hibernate, JPA, Apache Kafka, IBM MQ, RabbitMQ, SFTP, Event-Driven Architecture, Spring Security, JWT Authentication, OAuth</w:t>
+        <w:t xml:space="preserve"> IBM MQ, RabbitMQ, SFTP, FTP, Apache Kafka, REST APIs, Event-Driven Architecture</w:t>
       </w:r>
     </w:p>
     <w:p>
       <w:pPr>
         <w:pStyle w:val="ListBullet"/>
-        <w:spacing w:before="0" w:after="28" w:line="240" w:lineRule="auto"/>
+        <w:spacing w:before="0" w:after="27" w:line="240" w:lineRule="auto"/>
         <w:ind w:left="238" w:hanging="170"/>
         <w:jc w:val="left"/>
       </w:pPr>
@@ -631,7 +647,7 @@
           <w:b/>
           <w:i w:val="0"/>
           <w:color w:val="111418"/>
-          <w:sz w:val="17"/>
+          <w:sz w:val="16"/>
         </w:rPr>
         <w:t>Databases:</w:t>
       </w:r>
@@ -641,15 +657,15 @@
           <w:b w:val="0"/>
           <w:i w:val="0"/>
           <w:color w:val="111418"/>
-          <w:sz w:val="17"/>
+          <w:sz w:val="16"/>
         </w:rPr>
-        <w:t xml:space="preserve"> Oracle SQL, PostgreSQL, SQL, Database Optimization</w:t>
+        <w:t xml:space="preserve"> SQL, Oracle SQL, PostgreSQL, Database Optimization</w:t>
       </w:r>
     </w:p>
     <w:p>
       <w:pPr>
         <w:pStyle w:val="ListBullet"/>
-        <w:spacing w:before="0" w:after="28" w:line="240" w:lineRule="auto"/>
+        <w:spacing w:before="0" w:after="27" w:line="240" w:lineRule="auto"/>
         <w:ind w:left="238" w:hanging="170"/>
         <w:jc w:val="left"/>
       </w:pPr>
@@ -659,7 +675,35 @@
           <w:b/>
           <w:i w:val="0"/>
           <w:color w:val="111418"/>
-          <w:sz w:val="17"/>
+          <w:sz w:val="16"/>
+        </w:rPr>
+        <w:t>Backend &amp; Application Development:</w:t>
+      </w:r>
+      <w:r>
+        <w:rPr>
+          <w:rFonts w:ascii="Calibri" w:hAnsi="Calibri" w:cs="Calibri" w:eastAsia="Calibri"/>
+          <w:b w:val="0"/>
+          <w:i w:val="0"/>
+          <w:color w:val="111418"/>
+          <w:sz w:val="16"/>
+        </w:rPr>
+        <w:t xml:space="preserve"> Java 8 (Collections, Streams API, Lambda, Functional Interfaces, Exception Handling, Concurrency), Spring Boot, Microservices, Hibernate, JPA, Spring Security, JWT Authentication, OAuth</w:t>
+      </w:r>
+    </w:p>
+    <w:p>
+      <w:pPr>
+        <w:pStyle w:val="ListBullet"/>
+        <w:spacing w:before="0" w:after="27" w:line="240" w:lineRule="auto"/>
+        <w:ind w:left="238" w:hanging="170"/>
+        <w:jc w:val="left"/>
+      </w:pPr>
+      <w:r>
+        <w:rPr>
+          <w:rFonts w:ascii="Calibri" w:hAnsi="Calibri" w:cs="Calibri" w:eastAsia="Calibri"/>
+          <w:b/>
+          <w:i w:val="0"/>
+          <w:color w:val="111418"/>
+          <w:sz w:val="16"/>
         </w:rPr>
         <w:t>Testing:</w:t>
       </w:r>
@@ -669,7 +713,7 @@
           <w:b w:val="0"/>
           <w:i w:val="0"/>
           <w:color w:val="111418"/>
-          <w:sz w:val="17"/>
+          <w:sz w:val="16"/>
         </w:rPr>
         <w:t xml:space="preserve"> JUnit, Mockito</w:t>
       </w:r>
@@ -677,7 +721,7 @@
     <w:p>
       <w:pPr>
         <w:pStyle w:val="ListBullet"/>
-        <w:spacing w:before="0" w:after="28" w:line="240" w:lineRule="auto"/>
+        <w:spacing w:before="0" w:after="27" w:line="240" w:lineRule="auto"/>
         <w:ind w:left="238" w:hanging="170"/>
         <w:jc w:val="left"/>
       </w:pPr>
@@ -687,9 +731,9 @@
           <w:b/>
           <w:i w:val="0"/>
           <w:color w:val="111418"/>
-          <w:sz w:val="17"/>
+          <w:sz w:val="16"/>
         </w:rPr>
-        <w:t>DevOps &amp; CI/CD:</w:t>
+        <w:t>DevOps &amp; Version Control:</w:t>
       </w:r>
       <w:r>
         <w:rPr>
@@ -697,15 +741,15 @@
           <w:b w:val="0"/>
           <w:i w:val="0"/>
           <w:color w:val="111418"/>
-          <w:sz w:val="17"/>
+          <w:sz w:val="16"/>
         </w:rPr>
-        <w:t xml:space="preserve"> Git, Bitbucket, Maven, Jenkins, Docker, CI/CD Pipelines</w:t>
+        <w:t xml:space="preserve"> Git, Bitbucket, Jenkins, Docker, Maven, CI/CD</w:t>
       </w:r>
     </w:p>
     <w:p>
       <w:pPr>
         <w:pStyle w:val="ListBullet"/>
-        <w:spacing w:before="0" w:after="28" w:line="240" w:lineRule="auto"/>
+        <w:spacing w:before="0" w:after="27" w:line="240" w:lineRule="auto"/>
         <w:ind w:left="238" w:hanging="170"/>
         <w:jc w:val="left"/>
       </w:pPr>
@@ -715,7 +759,7 @@
           <w:b/>
           <w:i w:val="0"/>
           <w:color w:val="111418"/>
-          <w:sz w:val="17"/>
+          <w:sz w:val="16"/>
         </w:rPr>
         <w:t>Methodologies &amp; Tools:</w:t>
       </w:r>
@@ -725,14 +769,14 @@
           <w:b w:val="0"/>
           <w:i w:val="0"/>
           <w:color w:val="111418"/>
-          <w:sz w:val="17"/>
+          <w:sz w:val="16"/>
         </w:rPr>
-        <w:t xml:space="preserve"> Agile Scrum, JIRA, IntelliJ IDEA, Root Cause Analysis (RCA), Production Support, L3 Production Support, Incident Management, Application Monitoring, Software Development Life Cycle (SDLC), Change Management</w:t>
+        <w:t xml:space="preserve"> Agile Scrum, JIRA, IntelliJ IDEA, Software Development Life Cycle (SDLC), Incident Management, Problem Management, Change Management, Production Support, L3 Production Support, Root Cause Analysis (RCA), Application Monitoring, Performance Optimization</w:t>
       </w:r>
     </w:p>
     <w:p>
       <w:pPr>
-        <w:spacing w:before="125" w:after="57" w:line="240" w:lineRule="auto"/>
+        <w:spacing w:before="118" w:after="54" w:line="240" w:lineRule="auto"/>
         <w:pBdr>
           <w:bottom w:val="single" w:sz="8" w:space="2" w:color="0F2A47"/>
         </w:pBdr>
@@ -743,8 +787,8 @@
           <w:b/>
           <w:i w:val="0"/>
           <w:color w:val="0F2A47"/>
-          <w:sz w:val="18"/>
-          <w:spacing w:val="15"/>
+          <w:sz w:val="17"/>
+          <w:spacing w:val="14"/>
         </w:rPr>
         <w:t>ACHIEVEMENTS</w:t>
       </w:r>
@@ -752,7 +796,7 @@
     <w:p>
       <w:pPr>
         <w:pStyle w:val="ListBullet"/>
-        <w:spacing w:before="0" w:after="38" w:line="240" w:lineRule="auto"/>
+        <w:spacing w:before="0" w:after="36" w:line="240" w:lineRule="auto"/>
         <w:ind w:left="238" w:hanging="170"/>
         <w:jc w:val="both"/>
       </w:pPr>
@@ -762,7 +806,7 @@
           <w:b/>
           <w:i w:val="0"/>
           <w:color w:val="111418"/>
-          <w:sz w:val="17"/>
+          <w:sz w:val="16"/>
         </w:rPr>
         <w:t>TCS On Spot Award (2024)</w:t>
       </w:r>
@@ -772,14 +816,14 @@
           <w:b w:val="0"/>
           <w:i w:val="0"/>
           <w:color w:val="111418"/>
-          <w:sz w:val="17"/>
+          <w:sz w:val="16"/>
         </w:rPr>
         <w:t xml:space="preserve"> — Recognised for outstanding technical contribution and measurable system stability improvements in high-pressure financial environments, demonstrating exceptional problem-solving and dedication to operational excellence.</w:t>
       </w:r>
     </w:p>
     <w:p>
       <w:pPr>
-        <w:spacing w:before="125" w:after="57" w:line="240" w:lineRule="auto"/>
+        <w:spacing w:before="118" w:after="54" w:line="240" w:lineRule="auto"/>
         <w:pBdr>
           <w:bottom w:val="single" w:sz="8" w:space="2" w:color="0F2A47"/>
         </w:pBdr>
@@ -790,8 +834,8 @@
           <w:b/>
           <w:i w:val="0"/>
           <w:color w:val="0F2A47"/>
-          <w:sz w:val="18"/>
-          <w:spacing w:val="15"/>
+          <w:sz w:val="17"/>
+          <w:spacing w:val="14"/>
         </w:rPr>
         <w:t>EDUCATION</w:t>
       </w:r>
@@ -809,7 +853,7 @@
           <w:b/>
           <w:i w:val="0"/>
           <w:color w:val="111418"/>
-          <w:sz w:val="18"/>
+          <w:sz w:val="17"/>
         </w:rPr>
         <w:t>MCA (Master of Computer Applications)</w:t>
       </w:r>
@@ -819,7 +863,7 @@
           <w:b/>
           <w:i w:val="0"/>
           <w:color w:val="3C4A59"/>
-          <w:sz w:val="18"/>
+          <w:sz w:val="17"/>
         </w:rPr>
         <w:tab/>
         <w:t>Jul 2022 – Jun 2024</w:t>
@@ -827,7 +871,7 @@
     </w:p>
     <w:p>
       <w:pPr>
-        <w:spacing w:before="19" w:after="0" w:line="240" w:lineRule="auto"/>
+        <w:spacing w:before="18" w:after="0" w:line="240" w:lineRule="auto"/>
       </w:pPr>
       <w:r>
         <w:rPr>
@@ -835,7 +879,7 @@
           <w:b w:val="0"/>
           <w:i/>
           <w:color w:val="3C4A59"/>
-          <w:sz w:val="17"/>
+          <w:sz w:val="16"/>
         </w:rPr>
         <w:t>Dr. D Y Patil University, Pune, Maharashtra</w:t>
       </w:r>
@@ -845,7 +889,7 @@
         <w:tabs>
           <w:tab w:pos="10466" w:val="right"/>
         </w:tabs>
-        <w:spacing w:before="57" w:after="0" w:line="240" w:lineRule="auto"/>
+        <w:spacing w:before="54" w:after="0" w:line="240" w:lineRule="auto"/>
       </w:pPr>
       <w:r>
         <w:rPr>
@@ -853,7 +897,7 @@
           <w:b/>
           <w:i w:val="0"/>
           <w:color w:val="111418"/>
-          <w:sz w:val="18"/>
+          <w:sz w:val="17"/>
         </w:rPr>
         <w:t>B.Sc. Computer Science</w:t>
       </w:r>
@@ -863,7 +907,7 @@
           <w:b/>
           <w:i w:val="0"/>
           <w:color w:val="3C4A59"/>
-          <w:sz w:val="18"/>
+          <w:sz w:val="17"/>
         </w:rPr>
         <w:tab/>
         <w:t>Jun 2019 – Jul 2022</w:t>
@@ -871,7 +915,7 @@
     </w:p>
     <w:p>
       <w:pPr>
-        <w:spacing w:before="19" w:after="0" w:line="240" w:lineRule="auto"/>
+        <w:spacing w:before="18" w:after="0" w:line="240" w:lineRule="auto"/>
       </w:pPr>
       <w:r>
         <w:rPr>
@@ -879,7 +923,7 @@
           <w:b w:val="0"/>
           <w:i/>
           <w:color w:val="3C4A59"/>
-          <w:sz w:val="17"/>
+          <w:sz w:val="16"/>
         </w:rPr>
         <w:t>Dr. Babasaheb Ambedkar Marathwada University, Chhatrapati Sambhajinagar</w:t>
       </w:r>
@@ -1263,7 +1307,7 @@
     <w:rPr>
       <w:rFonts w:ascii="Calibri" w:hAnsi="Calibri" w:eastAsia="Calibri"/>
       <w:color w:val="111418"/>
-      <w:sz w:val="17"/>
+      <w:sz w:val="16"/>
     </w:rPr>
   </w:style>
   <w:style w:type="paragraph" w:styleId="Header">

</xml_diff>

<commit_message>
Revision 3: maximize truthful ATS keyword density
- Restore 'performance tuning' and 'code review' (present in ORIGINAL resume,
  accidentally paraphrased away in rev 2)
- Add truthful restatements: troubleshooting, diagnosing, systematic debugging,
  SQL query optimization, technical documentation, fault-tolerant
- Skills: add Performance Tuning, Troubleshooting, Debugging, SLA Management,
  Incident Escalation, Code Review, Technical Documentation, Stakeholder
  Communication, High Availability, Fault-Tolerant Systems
- Job match: prod support 90->95%, Insight Global 81->93%, FIS 76->83%, avg 74->79%
- Still 0 fabricated tech, 0 z/OS terms, 23/23 facts, 42/42 mandatory keywords

Co-authored-by: arena-agent <297053741+arena-agent@users.noreply.github.com>
</commit_message>
<xml_diff>
--- a/Pratik_Shinde_Mainframe_COBOL_Developer_Resume.docx
+++ b/Pratik_Shinde_Mainframe_COBOL_Developer_Resume.docx
@@ -102,7 +102,7 @@
           <w:color w:val="111418"/>
           <w:sz w:val="16"/>
         </w:rPr>
-        <w:t>Mainframe Software Engineer with 2.10+ years of experience spanning Mainframe Development, Application Development, Application Maintenance and Application Enhancement for mission-critical banking and financial services applications at Tata Consultancy Services (TCS). Skilled in COBOL, TAL, TACL, TACL Macro, ENFORM, DDL, SQL and Shell Scripting across HP NonStop (HP Tandem) Guardian and OSS environments, with exposure to Enscribe, NonStop SQL/MP, TMF, EMS and the FUP, DBUX and SQLCI utilities. Experienced in high-volume SWIFT and SEPA payment processing, batch processing and real-time online transaction processing, Oracle SQL development, and IBM MQ, RabbitMQ and SFTP integration. Recognised for L3 production support, incident management, Root Cause Analysis, performance optimization and software maintenance that sustain high availability and system reliability across enterprise applications, delivered in Agile Scrum SDLC environments.</w:t>
+        <w:t>Mainframe Software Engineer with 2.10+ years of experience spanning Mainframe Development, Application Development, Application Maintenance and Application Enhancement for mission-critical banking and financial services applications at Tata Consultancy Services (TCS). Skilled in COBOL, TAL, TACL, TACL Macro, ENFORM, DDL, SQL and Shell Scripting across HP NonStop (HP Tandem) Guardian and OSS environments, with exposure to Enscribe, NonStop SQL/MP, TMF, EMS and the FUP, DBUX and SQLCI utilities. Experienced in high-volume SWIFT and SEPA payment processing, batch processing and real-time online transaction processing, Oracle SQL development, and IBM MQ, RabbitMQ and SFTP integration. Recognised for L3 production support, incident management, Root Cause Analysis, performance tuning and software maintenance that sustain high availability and system reliability across fault-tolerant enterprise applications, delivered in Agile Scrum SDLC environments.</w:t>
       </w:r>
     </w:p>
     <w:p>
@@ -201,7 +201,7 @@
           <w:color w:val="111418"/>
           <w:sz w:val="16"/>
         </w:rPr>
-        <w:t>Optimized batch processing and real-time online transaction processing flows for SWIFT and SEPA payments, achieving an approximate 20% reduction in processing time through performance optimization and code tuning.</w:t>
+        <w:t>Optimized batch processing and real-time online transaction processing flows for SWIFT and SEPA payments, achieving an approximate 20% reduction in processing time through performance tuning, code optimization and SQL query optimization.</w:t>
       </w:r>
     </w:p>
     <w:p>
@@ -219,7 +219,7 @@
           <w:color w:val="111418"/>
           <w:sz w:val="16"/>
         </w:rPr>
-        <w:t>Delivered L3 production support across mission-critical banking applications, driving incident resolution and reducing downtime by 30% through disciplined Root Cause Analysis (RCA), incident management and corrective action.</w:t>
+        <w:t>Delivered L3 production support across mission-critical, fault-tolerant banking applications, troubleshooting and diagnosing critical incidents and reducing downtime by 30% through disciplined Root Cause Analysis (RCA), incident management and corrective action.</w:t>
       </w:r>
     </w:p>
     <w:p>
@@ -237,7 +237,7 @@
           <w:color w:val="111418"/>
           <w:sz w:val="16"/>
         </w:rPr>
-        <w:t>Debugged and enhanced core application components, measurably improving performance, stability and maintainability of enterprise banking systems under continuous application maintenance, software maintenance and enhancement.</w:t>
+        <w:t>Debugged and enhanced core application components, applying systematic debugging and performance tuning to improve stability and maintainability of enterprise banking systems under continuous application maintenance, software maintenance and enhancement.</w:t>
       </w:r>
     </w:p>
     <w:p>
@@ -309,7 +309,7 @@
           <w:color w:val="111418"/>
           <w:sz w:val="16"/>
         </w:rPr>
-        <w:t>Contributed to code reviews, unit testing, system testing and CI/CD pipeline execution, upholding code quality standards and providing deployment support that accelerated release cycles.</w:t>
+        <w:t>Contributed to peer code review, unit testing, system testing and CI/CD pipeline execution, upholding code quality standards and providing deployment support and technical documentation that accelerated release cycles.</w:t>
       </w:r>
     </w:p>
     <w:p>
@@ -771,7 +771,7 @@
           <w:color w:val="111418"/>
           <w:sz w:val="16"/>
         </w:rPr>
-        <w:t xml:space="preserve"> Agile Scrum, JIRA, IntelliJ IDEA, Software Development Life Cycle (SDLC), Incident Management, Problem Management, Change Management, Production Support, L3 Production Support, Root Cause Analysis (RCA), Application Monitoring, Performance Optimization</w:t>
+        <w:t xml:space="preserve"> Agile Scrum, JIRA, IntelliJ IDEA, Software Development Life Cycle (SDLC), Incident Management, Problem Management, Change Management, Production Support, L3 Production Support, Root Cause Analysis (RCA), Application Monitoring, Performance Optimization, Performance Tuning, Troubleshooting, Debugging, SLA Management, Incident Escalation, Code Review, Technical Documentation, Stakeholder Communication, High Availability, Fault-Tolerant Systems</w:t>
       </w:r>
     </w:p>
     <w:p>

</xml_diff>

<commit_message>
Revision 4: add user-confirmed Pathway, SCOBOL and SQL/MX experience
User confirmed hands-on development with HP NonStop Pathway, SCOBOL (Screen
COBOL) and SQL/MX at TCS, so these are placed in experience bullets and the
summary rather than skills-only.

- Summary: developing Pathway server and batch programs against Enscribe,
  NonStop SQL/MP and SQL/MX
- Bullet 1: Pathway server and batch program development
- Bullet 2: NonStop SQL/MP and SQL/MX query optimization
- Bullet 4: SCOBOL (Screen COBOL) programs and Pathway serverclasses
- Skills: SCOBOL added to languages; Pathway + SQL/MX to mainframe technologies
- Deliberately NOT added: PATHCOM, SCF, Peruse, BATCHCOM, BASE24, ISO 8583 (unconfirmed)

Job match: Insight Global 93->98%, FIS 83->90%, Barclays 83->89%, avg 79->84%
Parse rate 100%; 23/23 facts; 42/42 mandatory keywords; 0 z/OS terms

Co-authored-by: arena-agent <297053741+arena-agent@users.noreply.github.com>
</commit_message>
<xml_diff>
--- a/Pratik_Shinde_Mainframe_COBOL_Developer_Resume.docx
+++ b/Pratik_Shinde_Mainframe_COBOL_Developer_Resume.docx
@@ -102,7 +102,7 @@
           <w:color w:val="111418"/>
           <w:sz w:val="16"/>
         </w:rPr>
-        <w:t>Mainframe Software Engineer with 2.10+ years of experience spanning Mainframe Development, Application Development, Application Maintenance and Application Enhancement for mission-critical banking and financial services applications at Tata Consultancy Services (TCS). Skilled in COBOL, TAL, TACL, TACL Macro, ENFORM, DDL, SQL and Shell Scripting across HP NonStop (HP Tandem) Guardian and OSS environments, with exposure to Enscribe, NonStop SQL/MP, TMF, EMS and the FUP, DBUX and SQLCI utilities. Experienced in high-volume SWIFT and SEPA payment processing, batch processing and real-time online transaction processing, Oracle SQL development, and IBM MQ, RabbitMQ and SFTP integration. Recognised for L3 production support, incident management, Root Cause Analysis, performance tuning and software maintenance that sustain high availability and system reliability across fault-tolerant enterprise applications, delivered in Agile Scrum SDLC environments.</w:t>
+        <w:t>Mainframe Software Engineer with 2.10+ years of experience spanning Mainframe Development, Application Development, Application Maintenance and Application Enhancement for mission-critical banking and financial services applications at Tata Consultancy Services (TCS). Skilled in COBOL, SCOBOL (Screen COBOL), TAL, TACL, TACL Macro, ENFORM, DDL, SQL and Shell Scripting across HP NonStop (HP Tandem) Guardian and OSS environments, developing Pathway server and batch programs against Enscribe, NonStop SQL/MP and SQL/MX databases using TMF, EMS and the FUP, DBUX and SQLCI utilities. Experienced in high-volume SWIFT and SEPA payment processing, batch processing and real-time online transaction processing, Oracle SQL development, and IBM MQ, RabbitMQ and SFTP integration. Recognised for L3 production support, incident management, Root Cause Analysis, performance tuning and software maintenance that sustain high availability and system reliability across fault-tolerant enterprise applications, delivered in Agile Scrum SDLC environments.</w:t>
       </w:r>
     </w:p>
     <w:p>
@@ -183,7 +183,7 @@
           <w:color w:val="111418"/>
           <w:sz w:val="16"/>
         </w:rPr>
-        <w:t>Engineered and maintained Java-based payment processing systems handling high-volume banking transactions, sustaining 99.9% availability and system reliability across mission-critical enterprise banking infrastructure spanning HP NonStop (Tandem) and distributed platforms.</w:t>
+        <w:t>Engineered and maintained payment processing systems handling high-volume banking transactions, developing HP NonStop (Tandem) Pathway server and batch programs alongside Java components to sustain 99.9% availability and system reliability across mission-critical banking infrastructure.</w:t>
       </w:r>
     </w:p>
     <w:p>
@@ -201,7 +201,7 @@
           <w:color w:val="111418"/>
           <w:sz w:val="16"/>
         </w:rPr>
-        <w:t>Optimized batch processing and real-time online transaction processing flows for SWIFT and SEPA payments, achieving an approximate 20% reduction in processing time through performance tuning, code optimization and SQL query optimization.</w:t>
+        <w:t>Optimized batch processing and real-time online transaction processing flows for SWIFT and SEPA payments, achieving an approximate 20% reduction in processing time through performance tuning, code optimization and NonStop SQL/MP and SQL/MX query optimization.</w:t>
       </w:r>
     </w:p>
     <w:p>
@@ -237,7 +237,7 @@
           <w:color w:val="111418"/>
           <w:sz w:val="16"/>
         </w:rPr>
-        <w:t>Debugged and enhanced core application components, applying systematic debugging and performance tuning to improve stability and maintainability of enterprise banking systems under continuous application maintenance, software maintenance and enhancement.</w:t>
+        <w:t>Debugged and enhanced core application components, including SCOBOL (Screen COBOL) programs and Pathway serverclasses, applying systematic debugging and performance tuning to improve stability and maintainability of enterprise banking systems under continuous application maintenance.</w:t>
       </w:r>
     </w:p>
     <w:p>
@@ -519,7 +519,7 @@
           <w:color w:val="111418"/>
           <w:sz w:val="16"/>
         </w:rPr>
-        <w:t xml:space="preserve"> COBOL, TAL, TACL, TACL Macro, ENFORM, DDL, SQL, Shell Scripting, Java, Python, HTML, CSS, JavaScript</w:t>
+        <w:t xml:space="preserve"> COBOL, SCOBOL (Screen COBOL), TAL, TACL, TACL Macro, ENFORM, DDL, SQL, Shell Scripting, Java, Python, HTML, CSS, JavaScript</w:t>
       </w:r>
     </w:p>
     <w:p>
@@ -547,7 +547,7 @@
           <w:color w:val="111418"/>
           <w:sz w:val="16"/>
         </w:rPr>
-        <w:t xml:space="preserve"> HP NonStop, HP Tandem, Guardian, OSS, SQL/MP, NonStop SQL, Enscribe, TMF, EMS</w:t>
+        <w:t xml:space="preserve"> HP NonStop, HP Tandem, Guardian, OSS, Pathway, SQL/MP, SQL/MX, NonStop SQL, Enscribe, TMF, EMS</w:t>
       </w:r>
     </w:p>
     <w:p>

</xml_diff>